<commit_message>
Fix cover page overflowing to a second page
The cover put every markdown blank line as an empty paragraph (12 content rows
became 24 paragraphs), which with 14-18pt fonts pushed content onto page 2.
Now skip blank lines on the cover and control spacing via paragraph space_after
(10pt) + a top margin, and use page_break_before on the first post-cover
paragraph instead of an empty break paragraph. Cover now sits on a single page
(~5.4in of ~9.5in usable height). Slightly reduced cover font sizes too.

Co-Authored-By: Claude Opus 4.8 <noreply@anthropic.com>
</commit_message>
<xml_diff>
--- a/docs/report/final_report_english.docx
+++ b/docs/report/final_report_english.docx
@@ -4,6 +4,77 @@
   <w:body>
     <w:p>
       <w:pPr>
+        <w:spacing w:after="200" w:before="560"/>
+        <w:jc w:val="center"/>
+      </w:pPr>
+      <w:r>
+        <w:rPr>
+          <w:rFonts w:ascii="Times New Roman" w:hAnsi="Times New Roman" w:eastAsia="標楷體"/>
+          <w:b w:val="0"/>
+          <w:sz w:val="26"/>
+        </w:rPr>
+        <w:t>Department of Biomechatronics Engineering</w:t>
+      </w:r>
+    </w:p>
+    <w:p>
+      <w:pPr>
+        <w:spacing w:after="200" w:before="40"/>
+        <w:jc w:val="center"/>
+      </w:pPr>
+      <w:r>
+        <w:rPr>
+          <w:rFonts w:ascii="Times New Roman" w:hAnsi="Times New Roman" w:eastAsia="標楷體"/>
+          <w:b w:val="0"/>
+          <w:sz w:val="26"/>
+        </w:rPr>
+        <w:t>College of Bioresources and Agriculture</w:t>
+      </w:r>
+    </w:p>
+    <w:p>
+      <w:pPr>
+        <w:spacing w:after="200" w:before="40"/>
+        <w:jc w:val="center"/>
+      </w:pPr>
+      <w:r>
+        <w:rPr>
+          <w:rFonts w:ascii="Times New Roman" w:hAnsi="Times New Roman" w:eastAsia="標楷體"/>
+          <w:b w:val="0"/>
+          <w:sz w:val="30"/>
+        </w:rPr>
+        <w:t>National Taiwan University</w:t>
+      </w:r>
+    </w:p>
+    <w:p>
+      <w:pPr>
+        <w:spacing w:after="200" w:before="40"/>
+        <w:jc w:val="center"/>
+      </w:pPr>
+      <w:r>
+        <w:rPr>
+          <w:rFonts w:ascii="Times New Roman" w:hAnsi="Times New Roman" w:eastAsia="標楷體"/>
+          <w:b w:val="0"/>
+          <w:sz w:val="30"/>
+        </w:rPr>
+        <w:t>Artificial Intelligence Implementation Final Report</w:t>
+      </w:r>
+    </w:p>
+    <w:p>
+      <w:pPr>
+        <w:spacing w:after="200" w:before="40"/>
+        <w:jc w:val="center"/>
+      </w:pPr>
+      <w:r>
+        <w:rPr>
+          <w:rFonts w:ascii="Times New Roman" w:hAnsi="Times New Roman" w:eastAsia="標楷體"/>
+          <w:b w:val="0"/>
+          <w:sz w:val="30"/>
+        </w:rPr>
+        <w:t>Reproducing and Migrating Bio-Inspired Torque-Based Quadruped Locomotion Control across Simulators</w:t>
+      </w:r>
+    </w:p>
+    <w:p>
+      <w:pPr>
+        <w:spacing w:after="200" w:before="40"/>
         <w:jc w:val="center"/>
       </w:pPr>
       <w:r>
@@ -12,12 +83,26 @@
           <w:b w:val="0"/>
           <w:sz w:val="28"/>
         </w:rPr>
-        <w:t>Department of Biomechatronics Engineering</w:t>
+        <w:t>Li Chuan-Han</w:t>
       </w:r>
     </w:p>
-    <w:p/>
     <w:p>
       <w:pPr>
+        <w:spacing w:after="200" w:before="40"/>
+        <w:jc w:val="center"/>
+      </w:pPr>
+      <w:r>
+        <w:rPr>
+          <w:rFonts w:ascii="Times New Roman" w:hAnsi="Times New Roman" w:eastAsia="標楷體"/>
+          <w:b w:val="0"/>
+          <w:sz w:val="26"/>
+        </w:rPr>
+        <w:t>Student ID: B11611027</w:t>
+      </w:r>
+    </w:p>
+    <w:p>
+      <w:pPr>
+        <w:spacing w:after="200" w:before="40"/>
         <w:jc w:val="center"/>
       </w:pPr>
       <w:r>
@@ -26,99 +111,13 @@
           <w:b w:val="0"/>
           <w:sz w:val="28"/>
         </w:rPr>
-        <w:t>College of Bioresources and Agriculture</w:t>
-      </w:r>
-    </w:p>
-    <w:p/>
-    <w:p>
-      <w:pPr>
-        <w:jc w:val="center"/>
-      </w:pPr>
-      <w:r>
-        <w:rPr>
-          <w:rFonts w:ascii="Times New Roman" w:hAnsi="Times New Roman" w:eastAsia="標楷體"/>
-          <w:b w:val="0"/>
-          <w:sz w:val="32"/>
-        </w:rPr>
-        <w:t>National Taiwan University</w:t>
-      </w:r>
-    </w:p>
-    <w:p/>
-    <w:p>
-      <w:pPr>
-        <w:jc w:val="center"/>
-      </w:pPr>
-      <w:r>
-        <w:rPr>
-          <w:rFonts w:ascii="Times New Roman" w:hAnsi="Times New Roman" w:eastAsia="標楷體"/>
-          <w:b w:val="0"/>
-          <w:sz w:val="32"/>
-        </w:rPr>
-        <w:t>Artificial Intelligence Implementation Final Report</w:t>
-      </w:r>
-    </w:p>
-    <w:p/>
-    <w:p>
-      <w:pPr>
-        <w:jc w:val="center"/>
-      </w:pPr>
-      <w:r>
-        <w:rPr>
-          <w:rFonts w:ascii="Times New Roman" w:hAnsi="Times New Roman" w:eastAsia="標楷體"/>
-          <w:b w:val="0"/>
-          <w:sz w:val="32"/>
-        </w:rPr>
-        <w:t>Reproducing and Migrating Bio-Inspired Torque-Based Quadruped Locomotion Control across Simulators</w:t>
-      </w:r>
-    </w:p>
-    <w:p/>
-    <w:p>
-      <w:pPr>
-        <w:jc w:val="center"/>
-      </w:pPr>
-      <w:r>
-        <w:rPr>
-          <w:rFonts w:ascii="Times New Roman" w:hAnsi="Times New Roman" w:eastAsia="標楷體"/>
-          <w:b w:val="0"/>
-          <w:sz w:val="36"/>
-        </w:rPr>
-        <w:t>Li Chuan-Han</w:t>
-      </w:r>
-    </w:p>
-    <w:p/>
-    <w:p>
-      <w:pPr>
-        <w:jc w:val="center"/>
-      </w:pPr>
-      <w:r>
-        <w:rPr>
-          <w:rFonts w:ascii="Times New Roman" w:hAnsi="Times New Roman" w:eastAsia="標楷體"/>
-          <w:b w:val="0"/>
-          <w:sz w:val="28"/>
-        </w:rPr>
-        <w:t>Student ID: B11611027</w:t>
-      </w:r>
-    </w:p>
-    <w:p/>
-    <w:p>
-      <w:pPr>
-        <w:jc w:val="center"/>
-      </w:pPr>
-      <w:r>
-        <w:rPr>
-          <w:rFonts w:ascii="Times New Roman" w:hAnsi="Times New Roman" w:eastAsia="標楷體"/>
-          <w:b w:val="0"/>
-          <w:sz w:val="36"/>
-        </w:rPr>
         <w:t>June, 2026</w:t>
       </w:r>
     </w:p>
-    <w:p/>
     <w:p>
-      <w:r>
-        <w:br/>
-        <w:br w:type="page"/>
-      </w:r>
+      <w:pPr>
+        <w:pageBreakBefore/>
+      </w:pPr>
     </w:p>
     <w:p>
       <w:pPr>

</xml_diff>

<commit_message>
Foreground the AI/RL framing in title and abstract
The course is "Artificial Intelligence Implementation," but the title led with
"torque control," which a non-specialist reader might mistake for a pure
robotics/control topic. The project is in fact entirely reinforcement learning
(PPO, neural-network policies, ablation studies). Reframed wording only — no
change to the actual work:
- Title: "Reinforcement Learning for Bio-Inspired Torque-Based Quadruped
  Locomotion: A Cross-Simulator Reproduction and Analysis" (RL up front).
- Abstract now opens by stating this is a deep RL project (NN policies, PPO,
  ablations).
- Keywords reordered to lead with Deep Reinforcement Learning / Neural Network
  Policy / PPO.

Co-Authored-By: Claude Opus 4.8 <noreply@anthropic.com>
</commit_message>
<xml_diff>
--- a/docs/report/final_report_english.docx
+++ b/docs/report/final_report_english.docx
@@ -67,9 +67,9 @@
         <w:rPr>
           <w:rFonts w:ascii="Times New Roman" w:hAnsi="Times New Roman" w:eastAsia="標楷體"/>
           <w:b w:val="0"/>
-          <w:sz w:val="30"/>
+          <w:sz w:val="26"/>
         </w:rPr>
-        <w:t>Reproducing and Migrating Bio-Inspired Torque-Based Quadruped Locomotion Control across Simulators</w:t>
+        <w:t>Reinforcement Learning for Bio-Inspired Torque-Based Quadruped Locomotion: A Cross-Simulator Reproduction and Analysis</w:t>
       </w:r>
     </w:p>
     <w:p>
@@ -271,7 +271,23 @@
           <w:b w:val="0"/>
           <w:sz w:val="24"/>
         </w:rPr>
-        <w:t xml:space="preserve">Reinforcement learning controllers for quadruped robots predominantly rely on </w:t>
+        <w:t xml:space="preserve">This report is a </w:t>
+      </w:r>
+      <w:r>
+        <w:rPr>
+          <w:rFonts w:ascii="Times New Roman" w:hAnsi="Times New Roman" w:eastAsia="標楷體"/>
+          <w:b/>
+          <w:sz w:val="24"/>
+        </w:rPr>
+        <w:t>deep reinforcement learning</w:t>
+      </w:r>
+      <w:r>
+        <w:rPr>
+          <w:rFonts w:ascii="Times New Roman" w:hAnsi="Times New Roman" w:eastAsia="標楷體"/>
+          <w:b w:val="0"/>
+          <w:sz w:val="24"/>
+        </w:rPr>
+        <w:t xml:space="preserve"> project: it trains and analyzes a quadruped locomotion controller using neural-network policies, the PPO algorithm, and ablation studies. Reinforcement learning controllers for quadruped robots predominantly rely on </w:t>
       </w:r>
       <w:r>
         <w:rPr>
@@ -405,7 +421,7 @@
           <w:b w:val="0"/>
           <w:sz w:val="24"/>
         </w:rPr>
-        <w:t>: Torque Control, Bio-Inspired Locomotion, Reinforcement Learning, Quadruped, Cross-Engine Reproduction, Isaac Gym, Isaac Lab</w:t>
+        <w:t>: Deep Reinforcement Learning, Neural Network Policy, PPO, Torque Control, Bio-Inspired Locomotion, Quadruped, Cross-Engine Reproduction</w:t>
       </w:r>
     </w:p>
     <w:p>

</xml_diff>

<commit_message>
Spell out SATA's full name in standard form on first mention
The abstract introduced "SATA" with a truncated expansion ("Safe and Adaptive
Torque-Based Locomotion") and in reverse order (acronym then gloss). Fixed to
the standard "full name (acronym)" binding with the paper's complete title:
"Safe and Adaptive Torque-Based Locomotion Policies Inspired by Animal Learning
(SATA)". Applied to both reports' abstracts.

Co-Authored-By: Claude Opus 4.8 <noreply@anthropic.com>
</commit_message>
<xml_diff>
--- a/docs/report/final_report_english.docx
+++ b/docs/report/final_report_english.docx
@@ -327,7 +327,7 @@
           <w:b/>
           <w:sz w:val="24"/>
         </w:rPr>
-        <w:t>SATA</w:t>
+        <w:t>Safe and Adaptive Torque-Based Locomotion Policies Inspired by Animal Learning (SATA)</w:t>
       </w:r>
       <w:r>
         <w:rPr>
@@ -335,7 +335,7 @@
           <w:b w:val="0"/>
           <w:sz w:val="24"/>
         </w:rPr>
-        <w:t xml:space="preserve"> (Safe and Adaptive Torque-Based Locomotion, arXiv:2502.12674), proposed by Li et al. in 2025 at the marmotlab of the National University of Singapore. We fully reproduce its torque control pipeline on the Unitree Go2 quadruped and analyze it through the lens of questions raised by adaptive and robust control.</w:t>
+        <w:t xml:space="preserve"> (arXiv:2502.12674), proposed by Li et al. in 2025 at the marmotlab of the National University of Singapore. We fully reproduce its torque control pipeline on the Unitree Go2 quadruped and analyze it through the lens of questions raised by adaptive and robust control.</w:t>
       </w:r>
     </w:p>
     <w:p>

</xml_diff>

<commit_message>
Add a dedicated RL/PPO methods chapter (per instructor feedback)
The instructor noted the report said too little about the method itself for an
"AI Implementation" course — RL and PPO were never explained. Added a new
Chapter 2 "Method: Reinforcement Learning and PPO" covering: the MDP framing
(state/action/reward/policy, why RL over a hand-designed control law), the PPO
algorithm (actor-critic, GAE advantage, clipped surrogate objective ε=0.2,
entropy bonus, adaptive-KL learning rate, and why PPO), the network and training
scale (MLP [512,256,128], 4096 envs, ~98k transitions/iter, 3000 iters ≈ 295M
steps), and the observation/action/reward design. Subsequent chapters renumbered
3–7; contents and cross-references updated. Same chapter added to the zh-TW
report (gitignored).

Co-Authored-By: Claude Opus 4.8 <noreply@anthropic.com>
</commit_message>
<xml_diff>
--- a/docs/report/final_report_english.docx
+++ b/docs/report/final_report_english.docx
@@ -169,7 +169,7 @@
           <w:b w:val="0"/>
           <w:sz w:val="24"/>
         </w:rPr>
-        <w:t>Chapter 2. Core Technology: Torque Control and the Bio-Inspired Locomotion Layer</w:t>
+        <w:t>Chapter 2. Method: Reinforcement Learning and PPO</w:t>
       </w:r>
     </w:p>
     <w:p>
@@ -182,7 +182,7 @@
           <w:b w:val="0"/>
           <w:sz w:val="24"/>
         </w:rPr>
-        <w:t>Chapter 3. Practical Implementation I: Reproducing and Analyzing SATA on Isaac Gym</w:t>
+        <w:t>Chapter 3. Core Technology: Torque Control and the Bio-Inspired Locomotion Layer</w:t>
       </w:r>
     </w:p>
     <w:p>
@@ -195,7 +195,7 @@
           <w:b w:val="0"/>
           <w:sz w:val="24"/>
         </w:rPr>
-        <w:t>Chapter 4. Practical Implementation II: Cross-Engine Migration to Isaac Lab</w:t>
+        <w:t>Chapter 4. Practical Implementation I: Reproducing and Analyzing SATA on Isaac Gym</w:t>
       </w:r>
     </w:p>
     <w:p>
@@ -208,7 +208,7 @@
           <w:b w:val="0"/>
           <w:sz w:val="24"/>
         </w:rPr>
-        <w:t>Chapter 5. Results and Methodological Rigor</w:t>
+        <w:t>Chapter 5. Practical Implementation II: Cross-Engine Migration to Isaac Lab</w:t>
       </w:r>
     </w:p>
     <w:p>
@@ -221,7 +221,20 @@
           <w:b w:val="0"/>
           <w:sz w:val="24"/>
         </w:rPr>
-        <w:t>Chapter 6. Conclusion and Reflection</w:t>
+        <w:t>Chapter 6. Results and Methodological Rigor</w:t>
+      </w:r>
+    </w:p>
+    <w:p>
+      <w:pPr>
+        <w:pStyle w:val="ListBullet"/>
+      </w:pPr>
+      <w:r>
+        <w:rPr>
+          <w:rFonts w:ascii="Times New Roman" w:hAnsi="Times New Roman" w:eastAsia="標楷體"/>
+          <w:b w:val="0"/>
+          <w:sz w:val="24"/>
+        </w:rPr>
+        <w:t>Chapter 7. Conclusion and Reflection</w:t>
       </w:r>
     </w:p>
     <w:p>
@@ -711,7 +724,1376 @@
           <w:b/>
           <w:sz w:val="32"/>
         </w:rPr>
-        <w:t>Chapter 2. Core Technology: Torque Control and the Bio-Inspired Locomotion Layer</w:t>
+        <w:t>Chapter 2. Method: Reinforcement Learning and PPO</w:t>
+      </w:r>
+    </w:p>
+    <w:p>
+      <w:r>
+        <w:rPr>
+          <w:rFonts w:ascii="Times New Roman" w:hAnsi="Times New Roman" w:eastAsia="標楷體"/>
+          <w:b w:val="0"/>
+          <w:sz w:val="24"/>
+        </w:rPr>
+        <w:t xml:space="preserve">The core method of this project is </w:t>
+      </w:r>
+      <w:r>
+        <w:rPr>
+          <w:rFonts w:ascii="Times New Roman" w:hAnsi="Times New Roman" w:eastAsia="標楷體"/>
+          <w:b/>
+          <w:sz w:val="24"/>
+        </w:rPr>
+        <w:t>reinforcement learning (RL)</w:t>
+      </w:r>
+      <w:r>
+        <w:rPr>
+          <w:rFonts w:ascii="Times New Roman" w:hAnsi="Times New Roman" w:eastAsia="標楷體"/>
+          <w:b w:val="0"/>
+          <w:sz w:val="24"/>
+        </w:rPr>
+        <w:t xml:space="preserve"> -- more precisely, training a neural-network policy with </w:t>
+      </w:r>
+      <w:r>
+        <w:rPr>
+          <w:rFonts w:ascii="Times New Roman" w:hAnsi="Times New Roman" w:eastAsia="標楷體"/>
+          <w:b/>
+          <w:sz w:val="24"/>
+        </w:rPr>
+        <w:t>Proximal Policy Optimization (PPO)</w:t>
+      </w:r>
+      <w:r>
+        <w:rPr>
+          <w:rFonts w:ascii="Times New Roman" w:hAnsi="Times New Roman" w:eastAsia="標楷體"/>
+          <w:b w:val="0"/>
+          <w:sz w:val="24"/>
+        </w:rPr>
+        <w:t>. This chapter explains the RL problem formulation, how PPO works, and the network, observation, action, reward, and hyperparameter settings actually used in this study.</w:t>
+      </w:r>
+    </w:p>
+    <w:p>
+      <w:pPr>
+        <w:pStyle w:val="Heading2"/>
+        <w:jc w:val="left"/>
+      </w:pPr>
+      <w:r>
+        <w:rPr>
+          <w:rFonts w:ascii="Times New Roman" w:hAnsi="Times New Roman" w:eastAsia="標楷體"/>
+          <w:b/>
+          <w:sz w:val="26"/>
+        </w:rPr>
+        <w:t>2.1 The Reinforcement Learning Problem</w:t>
+      </w:r>
+    </w:p>
+    <w:p>
+      <w:r>
+        <w:rPr>
+          <w:rFonts w:ascii="Times New Roman" w:hAnsi="Times New Roman" w:eastAsia="標楷體"/>
+          <w:b w:val="0"/>
+          <w:sz w:val="24"/>
+        </w:rPr>
+        <w:t xml:space="preserve">Quadruped locomotion control can be cast as a </w:t>
+      </w:r>
+      <w:r>
+        <w:rPr>
+          <w:rFonts w:ascii="Times New Roman" w:hAnsi="Times New Roman" w:eastAsia="標楷體"/>
+          <w:b/>
+          <w:sz w:val="24"/>
+        </w:rPr>
+        <w:t>Markov Decision Process (MDP)</w:t>
+      </w:r>
+      <w:r>
+        <w:rPr>
+          <w:rFonts w:ascii="Times New Roman" w:hAnsi="Times New Roman" w:eastAsia="標楷體"/>
+          <w:b w:val="0"/>
+          <w:sz w:val="24"/>
+        </w:rPr>
+        <w:t xml:space="preserve">: at each time step the agent (the robot policy) observes the current </w:t>
+      </w:r>
+      <w:r>
+        <w:rPr>
+          <w:rFonts w:ascii="Times New Roman" w:hAnsi="Times New Roman" w:eastAsia="標楷體"/>
+          <w:b/>
+          <w:sz w:val="24"/>
+        </w:rPr>
+        <w:t>state</w:t>
+      </w:r>
+      <w:r>
+        <w:rPr>
+          <w:rFonts w:ascii="Times New Roman" w:hAnsi="Times New Roman" w:eastAsia="標楷體"/>
+          <w:b w:val="0"/>
+          <w:sz w:val="24"/>
+        </w:rPr>
+        <w:t xml:space="preserve">, outputs an </w:t>
+      </w:r>
+      <w:r>
+        <w:rPr>
+          <w:rFonts w:ascii="Times New Roman" w:hAnsi="Times New Roman" w:eastAsia="標楷體"/>
+          <w:b/>
+          <w:sz w:val="24"/>
+        </w:rPr>
+        <w:t>action</w:t>
+      </w:r>
+      <w:r>
+        <w:rPr>
+          <w:rFonts w:ascii="Times New Roman" w:hAnsi="Times New Roman" w:eastAsia="標楷體"/>
+          <w:b w:val="0"/>
+          <w:sz w:val="24"/>
+        </w:rPr>
+        <w:t xml:space="preserve">, the environment transitions to the next state and returns a </w:t>
+      </w:r>
+      <w:r>
+        <w:rPr>
+          <w:rFonts w:ascii="Times New Roman" w:hAnsi="Times New Roman" w:eastAsia="標楷體"/>
+          <w:b/>
+          <w:sz w:val="24"/>
+        </w:rPr>
+        <w:t>reward</w:t>
+      </w:r>
+      <w:r>
+        <w:rPr>
+          <w:rFonts w:ascii="Times New Roman" w:hAnsi="Times New Roman" w:eastAsia="標楷體"/>
+          <w:b w:val="0"/>
+          <w:sz w:val="24"/>
+        </w:rPr>
+        <w:t xml:space="preserve">. The learning objective is to find a </w:t>
+      </w:r>
+      <w:r>
+        <w:rPr>
+          <w:rFonts w:ascii="Times New Roman" w:hAnsi="Times New Roman" w:eastAsia="標楷體"/>
+          <w:b/>
+          <w:sz w:val="24"/>
+        </w:rPr>
+        <w:t>policy</w:t>
+      </w:r>
+      <w:r>
+        <w:rPr>
+          <w:rFonts w:ascii="Times New Roman" w:hAnsi="Times New Roman" w:eastAsia="標楷體"/>
+          <w:b w:val="0"/>
+          <w:sz w:val="24"/>
+        </w:rPr>
+        <w:t xml:space="preserve"> $\pi$ -- a function mapping states to actions -- that maximizes the expected long-term discounted reward.</w:t>
+      </w:r>
+    </w:p>
+    <w:p>
+      <w:r>
+        <w:rPr>
+          <w:rFonts w:ascii="Times New Roman" w:hAnsi="Times New Roman" w:eastAsia="標楷體"/>
+          <w:b w:val="0"/>
+          <w:sz w:val="24"/>
+        </w:rPr>
+        <w:t xml:space="preserve">We use RL rather than a hand-designed control law because the dynamics of a quadruped on rough terrain are highly nonlinear and hard to model analytically; RL lets the policy </w:t>
+      </w:r>
+      <w:r>
+        <w:rPr>
+          <w:rFonts w:ascii="Times New Roman" w:hAnsi="Times New Roman" w:eastAsia="標楷體"/>
+          <w:b/>
+          <w:sz w:val="24"/>
+        </w:rPr>
+        <w:t>learn directly from large amounts of interaction with the simulated environment</w:t>
+      </w:r>
+      <w:r>
+        <w:rPr>
+          <w:rFonts w:ascii="Times New Roman" w:hAnsi="Times New Roman" w:eastAsia="標楷體"/>
+          <w:b w:val="0"/>
+          <w:sz w:val="24"/>
+        </w:rPr>
+        <w:t>, without writing down control equations in advance. In this project the state is the robot's proprioception (velocities, orientation, joint states, etc.), the action is the torque command for the twelve joints, and the reward encourages tracking velocity commands while maintaining body height and posture (see 2.4).</w:t>
+      </w:r>
+    </w:p>
+    <w:p>
+      <w:pPr>
+        <w:pStyle w:val="Heading2"/>
+        <w:jc w:val="left"/>
+      </w:pPr>
+      <w:r>
+        <w:rPr>
+          <w:rFonts w:ascii="Times New Roman" w:hAnsi="Times New Roman" w:eastAsia="標楷體"/>
+          <w:b/>
+          <w:sz w:val="26"/>
+        </w:rPr>
+        <w:t>2.2 The PPO Algorithm</w:t>
+      </w:r>
+    </w:p>
+    <w:p>
+      <w:r>
+        <w:rPr>
+          <w:rFonts w:ascii="Times New Roman" w:hAnsi="Times New Roman" w:eastAsia="標楷體"/>
+          <w:b w:val="0"/>
+          <w:sz w:val="24"/>
+        </w:rPr>
+        <w:t xml:space="preserve">PPO is one of the most widely used </w:t>
+      </w:r>
+      <w:r>
+        <w:rPr>
+          <w:rFonts w:ascii="Times New Roman" w:hAnsi="Times New Roman" w:eastAsia="標楷體"/>
+          <w:b/>
+          <w:sz w:val="24"/>
+        </w:rPr>
+        <w:t>policy-gradient</w:t>
+      </w:r>
+      <w:r>
+        <w:rPr>
+          <w:rFonts w:ascii="Times New Roman" w:hAnsi="Times New Roman" w:eastAsia="標楷體"/>
+          <w:b w:val="0"/>
+          <w:sz w:val="24"/>
+        </w:rPr>
+        <w:t xml:space="preserve"> algorithms for continuous control and adopts an </w:t>
+      </w:r>
+      <w:r>
+        <w:rPr>
+          <w:rFonts w:ascii="Times New Roman" w:hAnsi="Times New Roman" w:eastAsia="標楷體"/>
+          <w:b/>
+          <w:sz w:val="24"/>
+        </w:rPr>
+        <w:t>actor-critic</w:t>
+      </w:r>
+      <w:r>
+        <w:rPr>
+          <w:rFonts w:ascii="Times New Roman" w:hAnsi="Times New Roman" w:eastAsia="標楷體"/>
+          <w:b w:val="0"/>
+          <w:sz w:val="24"/>
+        </w:rPr>
+        <w:t xml:space="preserve"> architecture:</w:t>
+      </w:r>
+    </w:p>
+    <w:p>
+      <w:pPr>
+        <w:pStyle w:val="ListBullet"/>
+      </w:pPr>
+      <w:r>
+        <w:rPr>
+          <w:rFonts w:ascii="Times New Roman" w:hAnsi="Times New Roman" w:eastAsia="標楷體"/>
+          <w:b w:val="0"/>
+          <w:sz w:val="24"/>
+        </w:rPr>
+        <w:t xml:space="preserve">The </w:t>
+      </w:r>
+      <w:r>
+        <w:rPr>
+          <w:rFonts w:ascii="Times New Roman" w:hAnsi="Times New Roman" w:eastAsia="標楷體"/>
+          <w:b/>
+          <w:sz w:val="24"/>
+        </w:rPr>
+        <w:t>actor (policy network)</w:t>
+      </w:r>
+      <w:r>
+        <w:rPr>
+          <w:rFonts w:ascii="Times New Roman" w:hAnsi="Times New Roman" w:eastAsia="標楷體"/>
+          <w:b w:val="0"/>
+          <w:sz w:val="24"/>
+        </w:rPr>
+        <w:t xml:space="preserve"> outputs a probability distribution over actions (here a diagonal Gaussian whose mean is produced by the network and whose standard deviation is a learnable parameter);</w:t>
+      </w:r>
+    </w:p>
+    <w:p>
+      <w:pPr>
+        <w:pStyle w:val="ListBullet"/>
+      </w:pPr>
+      <w:r>
+        <w:rPr>
+          <w:rFonts w:ascii="Times New Roman" w:hAnsi="Times New Roman" w:eastAsia="標楷體"/>
+          <w:b w:val="0"/>
+          <w:sz w:val="24"/>
+        </w:rPr>
+        <w:t xml:space="preserve">The </w:t>
+      </w:r>
+      <w:r>
+        <w:rPr>
+          <w:rFonts w:ascii="Times New Roman" w:hAnsi="Times New Roman" w:eastAsia="標楷體"/>
+          <w:b/>
+          <w:sz w:val="24"/>
+        </w:rPr>
+        <w:t>critic (value network)</w:t>
+      </w:r>
+      <w:r>
+        <w:rPr>
+          <w:rFonts w:ascii="Times New Roman" w:hAnsi="Times New Roman" w:eastAsia="標楷體"/>
+          <w:b w:val="0"/>
+          <w:sz w:val="24"/>
+        </w:rPr>
+        <w:t xml:space="preserve"> estimates the value of a state, which is used to compute the </w:t>
+      </w:r>
+      <w:r>
+        <w:rPr>
+          <w:rFonts w:ascii="Times New Roman" w:hAnsi="Times New Roman" w:eastAsia="標楷體"/>
+          <w:b/>
+          <w:sz w:val="24"/>
+        </w:rPr>
+        <w:t>advantage</w:t>
+      </w:r>
+      <w:r>
+        <w:rPr>
+          <w:rFonts w:ascii="Times New Roman" w:hAnsi="Times New Roman" w:eastAsia="標楷體"/>
+          <w:b w:val="0"/>
+          <w:sz w:val="24"/>
+        </w:rPr>
+        <w:t xml:space="preserve"> -- how much better a given action is than average. We compute advantages with </w:t>
+      </w:r>
+      <w:r>
+        <w:rPr>
+          <w:rFonts w:ascii="Times New Roman" w:hAnsi="Times New Roman" w:eastAsia="標楷體"/>
+          <w:b/>
+          <w:sz w:val="24"/>
+        </w:rPr>
+        <w:t>Generalized Advantage Estimation (GAE, $\lambda=0.95$, $\gamma=0.99$)</w:t>
+      </w:r>
+      <w:r>
+        <w:rPr>
+          <w:rFonts w:ascii="Times New Roman" w:hAnsi="Times New Roman" w:eastAsia="標楷體"/>
+          <w:b w:val="0"/>
+          <w:sz w:val="24"/>
+        </w:rPr>
+        <w:t>.</w:t>
+      </w:r>
+    </w:p>
+    <w:p>
+      <w:r>
+        <w:rPr>
+          <w:rFonts w:ascii="Times New Roman" w:hAnsi="Times New Roman" w:eastAsia="標楷體"/>
+          <w:b w:val="0"/>
+          <w:sz w:val="24"/>
+        </w:rPr>
+        <w:t xml:space="preserve">PPO's key innovation is the </w:t>
+      </w:r>
+      <w:r>
+        <w:rPr>
+          <w:rFonts w:ascii="Times New Roman" w:hAnsi="Times New Roman" w:eastAsia="標楷體"/>
+          <w:b/>
+          <w:sz w:val="24"/>
+        </w:rPr>
+        <w:t>clipped surrogate objective</w:t>
+      </w:r>
+      <w:r>
+        <w:rPr>
+          <w:rFonts w:ascii="Times New Roman" w:hAnsi="Times New Roman" w:eastAsia="標楷體"/>
+          <w:b w:val="0"/>
+          <w:sz w:val="24"/>
+        </w:rPr>
+        <w:t>: it limits how far the new-to-old policy probability ratio may deviate from 1 (clip range $\epsilon=0.2$) on each update, preventing a single update from being so large that it destroys the learned policy. The loss is</w:t>
+      </w:r>
+    </w:p>
+    <w:p>
+      <w:pPr>
+        <w:shd w:fill="F2F2F2"/>
+      </w:pPr>
+      <w:r>
+        <w:rPr>
+          <w:rFonts w:ascii="Consolas" w:hAnsi="Consolas"/>
+          <w:sz w:val="20"/>
+        </w:rPr>
+        <w:t>L = clipped_surrogate(ε=0.2) + value_loss_coef × value_loss − entropy_coef × entropy</w:t>
+      </w:r>
+    </w:p>
+    <w:p>
+      <w:r>
+        <w:rPr>
+          <w:rFonts w:ascii="Times New Roman" w:hAnsi="Times New Roman" w:eastAsia="標楷體"/>
+          <w:b w:val="0"/>
+          <w:sz w:val="24"/>
+        </w:rPr>
+        <w:t xml:space="preserve">where the entropy term (coefficient 0.01) encourages exploration and avoids premature convergence. We also use an </w:t>
+      </w:r>
+      <w:r>
+        <w:rPr>
+          <w:rFonts w:ascii="Times New Roman" w:hAnsi="Times New Roman" w:eastAsia="標楷體"/>
+          <w:b/>
+          <w:sz w:val="24"/>
+        </w:rPr>
+        <w:t>adaptive learning rate</w:t>
+      </w:r>
+      <w:r>
+        <w:rPr>
+          <w:rFonts w:ascii="Times New Roman" w:hAnsi="Times New Roman" w:eastAsia="標楷體"/>
+          <w:b w:val="0"/>
+          <w:sz w:val="24"/>
+        </w:rPr>
+        <w:t>: based on the measured KL divergence each iteration compared with a target (desired_kl = 0.01), the learning rate is doubled or halved to keep updates within a stable range.</w:t>
+      </w:r>
+    </w:p>
+    <w:p>
+      <w:r>
+        <w:rPr>
+          <w:rFonts w:ascii="Times New Roman" w:hAnsi="Times New Roman" w:eastAsia="標楷體"/>
+          <w:b w:val="0"/>
+          <w:sz w:val="22"/>
+        </w:rPr>
+        <w:t>Why PPO: it strikes a good balance between sample efficiency and stability under massively parallel simulation, and it is the algorithm used by the original SATA work -- reproducing with the same algorithm lets us attribute any differences to the environment or design rather than to the algorithm itself.</w:t>
+      </w:r>
+    </w:p>
+    <w:p>
+      <w:pPr>
+        <w:pStyle w:val="Heading2"/>
+        <w:jc w:val="left"/>
+      </w:pPr>
+      <w:r>
+        <w:rPr>
+          <w:rFonts w:ascii="Times New Roman" w:hAnsi="Times New Roman" w:eastAsia="標楷體"/>
+          <w:b/>
+          <w:sz w:val="26"/>
+        </w:rPr>
+        <w:t>2.3 Network Architecture and Training Scale</w:t>
+      </w:r>
+    </w:p>
+    <w:p>
+      <w:pPr>
+        <w:pStyle w:val="ListBullet"/>
+      </w:pPr>
+      <w:r>
+        <w:rPr>
+          <w:rFonts w:ascii="Times New Roman" w:hAnsi="Times New Roman" w:eastAsia="標楷體"/>
+          <w:b/>
+          <w:sz w:val="24"/>
+        </w:rPr>
+        <w:t>Network</w:t>
+      </w:r>
+      <w:r>
+        <w:rPr>
+          <w:rFonts w:ascii="Times New Roman" w:hAnsi="Times New Roman" w:eastAsia="標楷體"/>
+          <w:b w:val="0"/>
+          <w:sz w:val="24"/>
+        </w:rPr>
+        <w:t>: both actor and critic are three-layer multilayer perceptrons (MLPs) with hidden layers `[512, 256, 128]` and ELU activations; both share the same 60-dimensional observation (no privileged information). The actor outputs a 12-dimensional Gaussian action (initial standard deviation 1.0). About 400k parameters in total.</w:t>
+      </w:r>
+    </w:p>
+    <w:p>
+      <w:pPr>
+        <w:pStyle w:val="ListBullet"/>
+      </w:pPr>
+      <w:r>
+        <w:rPr>
+          <w:rFonts w:ascii="Times New Roman" w:hAnsi="Times New Roman" w:eastAsia="標楷體"/>
+          <w:b/>
+          <w:sz w:val="24"/>
+        </w:rPr>
+        <w:t>Training scale</w:t>
+      </w:r>
+      <w:r>
+        <w:rPr>
+          <w:rFonts w:ascii="Times New Roman" w:hAnsi="Times New Roman" w:eastAsia="標楷體"/>
+          <w:b w:val="0"/>
+          <w:sz w:val="24"/>
+        </w:rPr>
+        <w:t>: 4096 parallel environments; each iteration collects 24 steps × 4096 environments ≈ 98,000 transitions; each iteration performs 5 epochs × 4 mini-batches = 20 gradient updates. Trained for 3000 iterations, roughly 295 million environment steps. Other hyperparameters: value-loss coefficient 1.0, gradient-norm clip 1.0.</w:t>
+      </w:r>
+    </w:p>
+    <w:p>
+      <w:pPr>
+        <w:pStyle w:val="Heading2"/>
+        <w:jc w:val="left"/>
+      </w:pPr>
+      <w:r>
+        <w:rPr>
+          <w:rFonts w:ascii="Times New Roman" w:hAnsi="Times New Roman" w:eastAsia="標楷體"/>
+          <w:b/>
+          <w:sz w:val="26"/>
+        </w:rPr>
+        <w:t>2.4 Observation, Action, and Reward Design</w:t>
+      </w:r>
+    </w:p>
+    <w:p>
+      <w:r>
+        <w:rPr>
+          <w:rFonts w:ascii="Times New Roman" w:hAnsi="Times New Roman" w:eastAsia="標楷體"/>
+          <w:b/>
+          <w:sz w:val="24"/>
+        </w:rPr>
+        <w:t>Observation (60-dim)</w:t>
+      </w:r>
+      <w:r>
+        <w:rPr>
+          <w:rFonts w:ascii="Times New Roman" w:hAnsi="Times New Roman" w:eastAsia="標楷體"/>
+          <w:b w:val="0"/>
+          <w:sz w:val="24"/>
+        </w:rPr>
+        <w:t xml:space="preserve"> -- the robot's proprioception, concatenated as follows:</w:t>
+      </w:r>
+    </w:p>
+    <w:tbl>
+      <w:tblPr>
+        <w:tblStyle w:val="TableGrid"/>
+        <w:tblW w:type="auto" w:w="0"/>
+        <w:tblLook w:firstColumn="1" w:firstRow="1" w:lastColumn="0" w:lastRow="0" w:noHBand="0" w:noVBand="1" w:val="04A0"/>
+      </w:tblPr>
+      <w:tblGrid>
+        <w:gridCol w:w="4320"/>
+        <w:gridCol w:w="4320"/>
+      </w:tblGrid>
+      <w:tr>
+        <w:tc>
+          <w:tcPr>
+            <w:tcW w:type="dxa" w:w="4320"/>
+          </w:tcPr>
+          <w:p>
+            <w:r/>
+            <w:r>
+              <w:rPr>
+                <w:rFonts w:ascii="Times New Roman" w:hAnsi="Times New Roman" w:eastAsia="標楷體"/>
+                <w:b/>
+                <w:sz w:val="20"/>
+              </w:rPr>
+              <w:t>Index</w:t>
+            </w:r>
+          </w:p>
+        </w:tc>
+        <w:tc>
+          <w:tcPr>
+            <w:tcW w:type="dxa" w:w="4320"/>
+          </w:tcPr>
+          <w:p>
+            <w:r/>
+            <w:r>
+              <w:rPr>
+                <w:rFonts w:ascii="Times New Roman" w:hAnsi="Times New Roman" w:eastAsia="標楷體"/>
+                <w:b/>
+                <w:sz w:val="20"/>
+              </w:rPr>
+              <w:t>Content</w:t>
+            </w:r>
+          </w:p>
+        </w:tc>
+      </w:tr>
+      <w:tr>
+        <w:tc>
+          <w:tcPr>
+            <w:tcW w:type="dxa" w:w="4320"/>
+          </w:tcPr>
+          <w:p>
+            <w:r/>
+            <w:r>
+              <w:rPr>
+                <w:rFonts w:ascii="Times New Roman" w:hAnsi="Times New Roman" w:eastAsia="標楷體"/>
+                <w:b w:val="0"/>
+                <w:sz w:val="20"/>
+              </w:rPr>
+              <w:t>0:3</w:t>
+            </w:r>
+          </w:p>
+        </w:tc>
+        <w:tc>
+          <w:tcPr>
+            <w:tcW w:type="dxa" w:w="4320"/>
+          </w:tcPr>
+          <w:p>
+            <w:r/>
+            <w:r>
+              <w:rPr>
+                <w:rFonts w:ascii="Times New Roman" w:hAnsi="Times New Roman" w:eastAsia="標楷體"/>
+                <w:b w:val="0"/>
+                <w:sz w:val="20"/>
+              </w:rPr>
+              <w:t>Base linear velocity (body frame)</w:t>
+            </w:r>
+          </w:p>
+        </w:tc>
+      </w:tr>
+      <w:tr>
+        <w:tc>
+          <w:tcPr>
+            <w:tcW w:type="dxa" w:w="4320"/>
+          </w:tcPr>
+          <w:p>
+            <w:r/>
+            <w:r>
+              <w:rPr>
+                <w:rFonts w:ascii="Times New Roman" w:hAnsi="Times New Roman" w:eastAsia="標楷體"/>
+                <w:b w:val="0"/>
+                <w:sz w:val="20"/>
+              </w:rPr>
+              <w:t>3:6</w:t>
+            </w:r>
+          </w:p>
+        </w:tc>
+        <w:tc>
+          <w:tcPr>
+            <w:tcW w:type="dxa" w:w="4320"/>
+          </w:tcPr>
+          <w:p>
+            <w:r/>
+            <w:r>
+              <w:rPr>
+                <w:rFonts w:ascii="Times New Roman" w:hAnsi="Times New Roman" w:eastAsia="標楷體"/>
+                <w:b w:val="0"/>
+                <w:sz w:val="20"/>
+              </w:rPr>
+              <w:t>Base angular velocity</w:t>
+            </w:r>
+          </w:p>
+        </w:tc>
+      </w:tr>
+      <w:tr>
+        <w:tc>
+          <w:tcPr>
+            <w:tcW w:type="dxa" w:w="4320"/>
+          </w:tcPr>
+          <w:p>
+            <w:r/>
+            <w:r>
+              <w:rPr>
+                <w:rFonts w:ascii="Times New Roman" w:hAnsi="Times New Roman" w:eastAsia="標楷體"/>
+                <w:b w:val="0"/>
+                <w:sz w:val="20"/>
+              </w:rPr>
+              <w:t>6:9</w:t>
+            </w:r>
+          </w:p>
+        </w:tc>
+        <w:tc>
+          <w:tcPr>
+            <w:tcW w:type="dxa" w:w="4320"/>
+          </w:tcPr>
+          <w:p>
+            <w:r/>
+            <w:r>
+              <w:rPr>
+                <w:rFonts w:ascii="Times New Roman" w:hAnsi="Times New Roman" w:eastAsia="標楷體"/>
+                <w:b w:val="0"/>
+                <w:sz w:val="20"/>
+              </w:rPr>
+              <w:t>Projected gravity vector (tilt sensing)</w:t>
+            </w:r>
+          </w:p>
+        </w:tc>
+      </w:tr>
+      <w:tr>
+        <w:tc>
+          <w:tcPr>
+            <w:tcW w:type="dxa" w:w="4320"/>
+          </w:tcPr>
+          <w:p>
+            <w:r/>
+            <w:r>
+              <w:rPr>
+                <w:rFonts w:ascii="Times New Roman" w:hAnsi="Times New Roman" w:eastAsia="標楷體"/>
+                <w:b w:val="0"/>
+                <w:sz w:val="20"/>
+              </w:rPr>
+              <w:t>9:21</w:t>
+            </w:r>
+          </w:p>
+        </w:tc>
+        <w:tc>
+          <w:tcPr>
+            <w:tcW w:type="dxa" w:w="4320"/>
+          </w:tcPr>
+          <w:p>
+            <w:r/>
+            <w:r>
+              <w:rPr>
+                <w:rFonts w:ascii="Times New Roman" w:hAnsi="Times New Roman" w:eastAsia="標楷體"/>
+                <w:b w:val="0"/>
+                <w:sz w:val="20"/>
+              </w:rPr>
+              <w:t>Joint angle − default angle (12 DOF)</w:t>
+            </w:r>
+          </w:p>
+        </w:tc>
+      </w:tr>
+      <w:tr>
+        <w:tc>
+          <w:tcPr>
+            <w:tcW w:type="dxa" w:w="4320"/>
+          </w:tcPr>
+          <w:p>
+            <w:r/>
+            <w:r>
+              <w:rPr>
+                <w:rFonts w:ascii="Times New Roman" w:hAnsi="Times New Roman" w:eastAsia="標楷體"/>
+                <w:b w:val="0"/>
+                <w:sz w:val="20"/>
+              </w:rPr>
+              <w:t>21:33</w:t>
+            </w:r>
+          </w:p>
+        </w:tc>
+        <w:tc>
+          <w:tcPr>
+            <w:tcW w:type="dxa" w:w="4320"/>
+          </w:tcPr>
+          <w:p>
+            <w:r/>
+            <w:r>
+              <w:rPr>
+                <w:rFonts w:ascii="Times New Roman" w:hAnsi="Times New Roman" w:eastAsia="標楷體"/>
+                <w:b w:val="0"/>
+                <w:sz w:val="20"/>
+              </w:rPr>
+              <w:t>Joint angular velocity (12 DOF)</w:t>
+            </w:r>
+          </w:p>
+        </w:tc>
+      </w:tr>
+      <w:tr>
+        <w:tc>
+          <w:tcPr>
+            <w:tcW w:type="dxa" w:w="4320"/>
+          </w:tcPr>
+          <w:p>
+            <w:r/>
+            <w:r>
+              <w:rPr>
+                <w:rFonts w:ascii="Times New Roman" w:hAnsi="Times New Roman" w:eastAsia="標楷體"/>
+                <w:b w:val="0"/>
+                <w:sz w:val="20"/>
+              </w:rPr>
+              <w:t>33:36</w:t>
+            </w:r>
+          </w:p>
+        </w:tc>
+        <w:tc>
+          <w:tcPr>
+            <w:tcW w:type="dxa" w:w="4320"/>
+          </w:tcPr>
+          <w:p>
+            <w:r/>
+            <w:r>
+              <w:rPr>
+                <w:rFonts w:ascii="Times New Roman" w:hAnsi="Times New Roman" w:eastAsia="標楷體"/>
+                <w:b w:val="0"/>
+                <w:sz w:val="20"/>
+              </w:rPr>
+              <w:t>Velocity command $(v_x, v_y, \omega_{yaw})$</w:t>
+            </w:r>
+          </w:p>
+        </w:tc>
+      </w:tr>
+      <w:tr>
+        <w:tc>
+          <w:tcPr>
+            <w:tcW w:type="dxa" w:w="4320"/>
+          </w:tcPr>
+          <w:p>
+            <w:r/>
+            <w:r>
+              <w:rPr>
+                <w:rFonts w:ascii="Times New Roman" w:hAnsi="Times New Roman" w:eastAsia="標楷體"/>
+                <w:b w:val="0"/>
+                <w:sz w:val="20"/>
+              </w:rPr>
+              <w:t>36:48</w:t>
+            </w:r>
+          </w:p>
+        </w:tc>
+        <w:tc>
+          <w:tcPr>
+            <w:tcW w:type="dxa" w:w="4320"/>
+          </w:tcPr>
+          <w:p>
+            <w:r/>
+            <w:r>
+              <w:rPr>
+                <w:rFonts w:ascii="Times New Roman" w:hAnsi="Times New Roman" w:eastAsia="標楷體"/>
+                <w:b w:val="0"/>
+                <w:sz w:val="20"/>
+              </w:rPr>
+              <w:t>Applied joint torques (12 DOF)</w:t>
+            </w:r>
+          </w:p>
+        </w:tc>
+      </w:tr>
+      <w:tr>
+        <w:tc>
+          <w:tcPr>
+            <w:tcW w:type="dxa" w:w="4320"/>
+          </w:tcPr>
+          <w:p>
+            <w:r/>
+            <w:r>
+              <w:rPr>
+                <w:rFonts w:ascii="Times New Roman" w:hAnsi="Times New Roman" w:eastAsia="標楷體"/>
+                <w:b w:val="0"/>
+                <w:sz w:val="20"/>
+              </w:rPr>
+              <w:t>48:60</w:t>
+            </w:r>
+          </w:p>
+        </w:tc>
+        <w:tc>
+          <w:tcPr>
+            <w:tcW w:type="dxa" w:w="4320"/>
+          </w:tcPr>
+          <w:p>
+            <w:r/>
+            <w:r>
+              <w:rPr>
+                <w:rFonts w:ascii="Times New Roman" w:hAnsi="Times New Roman" w:eastAsia="標楷體"/>
+                <w:b w:val="0"/>
+                <w:sz w:val="20"/>
+              </w:rPr>
+              <w:t>Per-DOF fatigue state (SATA-specific)</w:t>
+            </w:r>
+          </w:p>
+        </w:tc>
+      </w:tr>
+    </w:tbl>
+    <w:p>
+      <w:r>
+        <w:rPr>
+          <w:rFonts w:ascii="Times New Roman" w:hAnsi="Times New Roman" w:eastAsia="標楷體"/>
+          <w:b/>
+          <w:sz w:val="24"/>
+        </w:rPr>
+        <w:t>Action (12-dim)</w:t>
+      </w:r>
+      <w:r>
+        <w:rPr>
+          <w:rFonts w:ascii="Times New Roman" w:hAnsi="Times New Roman" w:eastAsia="標楷體"/>
+          <w:b w:val="0"/>
+          <w:sz w:val="24"/>
+        </w:rPr>
+        <w:t>: torque commands for the twelve joints (applied after the bio-inspired layer of Chapter 3).</w:t>
+      </w:r>
+    </w:p>
+    <w:p>
+      <w:r>
+        <w:rPr>
+          <w:rFonts w:ascii="Times New Roman" w:hAnsi="Times New Roman" w:eastAsia="標楷體"/>
+          <w:b/>
+          <w:sz w:val="24"/>
+        </w:rPr>
+        <w:t>Reward function</w:t>
+      </w:r>
+      <w:r>
+        <w:rPr>
+          <w:rFonts w:ascii="Times New Roman" w:hAnsi="Times New Roman" w:eastAsia="標楷體"/>
+          <w:b w:val="0"/>
+          <w:sz w:val="24"/>
+        </w:rPr>
+        <w:t xml:space="preserve"> -- nine terms (positive terms reward task achievement, negative terms penalize undesirable behavior):</w:t>
+      </w:r>
+    </w:p>
+    <w:tbl>
+      <w:tblPr>
+        <w:tblStyle w:val="TableGrid"/>
+        <w:tblW w:type="auto" w:w="0"/>
+        <w:tblLook w:firstColumn="1" w:firstRow="1" w:lastColumn="0" w:lastRow="0" w:noHBand="0" w:noVBand="1" w:val="04A0"/>
+      </w:tblPr>
+      <w:tblGrid>
+        <w:gridCol w:w="2880"/>
+        <w:gridCol w:w="2880"/>
+        <w:gridCol w:w="2880"/>
+      </w:tblGrid>
+      <w:tr>
+        <w:tc>
+          <w:tcPr>
+            <w:tcW w:type="dxa" w:w="2880"/>
+          </w:tcPr>
+          <w:p>
+            <w:r/>
+            <w:r>
+              <w:rPr>
+                <w:rFonts w:ascii="Times New Roman" w:hAnsi="Times New Roman" w:eastAsia="標楷體"/>
+                <w:b/>
+                <w:sz w:val="20"/>
+              </w:rPr>
+              <w:t>Term</w:t>
+            </w:r>
+          </w:p>
+        </w:tc>
+        <w:tc>
+          <w:tcPr>
+            <w:tcW w:type="dxa" w:w="2880"/>
+          </w:tcPr>
+          <w:p>
+            <w:r/>
+            <w:r>
+              <w:rPr>
+                <w:rFonts w:ascii="Times New Roman" w:hAnsi="Times New Roman" w:eastAsia="標楷體"/>
+                <w:b/>
+                <w:sz w:val="20"/>
+              </w:rPr>
+              <w:t>Weight</w:t>
+            </w:r>
+          </w:p>
+        </w:tc>
+        <w:tc>
+          <w:tcPr>
+            <w:tcW w:type="dxa" w:w="2880"/>
+          </w:tcPr>
+          <w:p>
+            <w:r/>
+            <w:r>
+              <w:rPr>
+                <w:rFonts w:ascii="Times New Roman" w:hAnsi="Times New Roman" w:eastAsia="標楷體"/>
+                <w:b/>
+                <w:sz w:val="20"/>
+              </w:rPr>
+              <w:t>Role</w:t>
+            </w:r>
+          </w:p>
+        </w:tc>
+      </w:tr>
+      <w:tr>
+        <w:tc>
+          <w:tcPr>
+            <w:tcW w:type="dxa" w:w="2880"/>
+          </w:tcPr>
+          <w:p>
+            <w:r/>
+            <w:r>
+              <w:rPr>
+                <w:rFonts w:ascii="Times New Roman" w:hAnsi="Times New Roman" w:eastAsia="標楷體"/>
+                <w:b w:val="0"/>
+                <w:sz w:val="20"/>
+              </w:rPr>
+              <w:t>forward</w:t>
+            </w:r>
+          </w:p>
+        </w:tc>
+        <w:tc>
+          <w:tcPr>
+            <w:tcW w:type="dxa" w:w="2880"/>
+          </w:tcPr>
+          <w:p>
+            <w:r/>
+            <w:r>
+              <w:rPr>
+                <w:rFonts w:ascii="Times New Roman" w:hAnsi="Times New Roman" w:eastAsia="標楷體"/>
+                <w:b w:val="0"/>
+                <w:sz w:val="20"/>
+              </w:rPr>
+              <w:t>+10</w:t>
+            </w:r>
+          </w:p>
+        </w:tc>
+        <w:tc>
+          <w:tcPr>
+            <w:tcW w:type="dxa" w:w="2880"/>
+          </w:tcPr>
+          <w:p>
+            <w:r/>
+            <w:r>
+              <w:rPr>
+                <w:rFonts w:ascii="Times New Roman" w:hAnsi="Times New Roman" w:eastAsia="標楷體"/>
+                <w:b w:val="0"/>
+                <w:sz w:val="20"/>
+              </w:rPr>
+              <w:t>Track forward velocity $v_x$ (exponential of error)</w:t>
+            </w:r>
+          </w:p>
+        </w:tc>
+      </w:tr>
+      <w:tr>
+        <w:tc>
+          <w:tcPr>
+            <w:tcW w:type="dxa" w:w="2880"/>
+          </w:tcPr>
+          <w:p>
+            <w:r/>
+            <w:r>
+              <w:rPr>
+                <w:rFonts w:ascii="Times New Roman" w:hAnsi="Times New Roman" w:eastAsia="標楷體"/>
+                <w:b w:val="0"/>
+                <w:sz w:val="20"/>
+              </w:rPr>
+              <w:t>head_height</w:t>
+            </w:r>
+          </w:p>
+        </w:tc>
+        <w:tc>
+          <w:tcPr>
+            <w:tcW w:type="dxa" w:w="2880"/>
+          </w:tcPr>
+          <w:p>
+            <w:r/>
+            <w:r>
+              <w:rPr>
+                <w:rFonts w:ascii="Times New Roman" w:hAnsi="Times New Roman" w:eastAsia="標楷體"/>
+                <w:b w:val="0"/>
+                <w:sz w:val="20"/>
+              </w:rPr>
+              <w:t>+5</w:t>
+            </w:r>
+          </w:p>
+        </w:tc>
+        <w:tc>
+          <w:tcPr>
+            <w:tcW w:type="dxa" w:w="2880"/>
+          </w:tcPr>
+          <w:p>
+            <w:r/>
+            <w:r>
+              <w:rPr>
+                <w:rFonts w:ascii="Times New Roman" w:hAnsi="Times New Roman" w:eastAsia="標楷體"/>
+                <w:b w:val="0"/>
+                <w:sz w:val="20"/>
+              </w:rPr>
+              <w:t>Maintain body height and stay upright</w:t>
+            </w:r>
+          </w:p>
+        </w:tc>
+      </w:tr>
+      <w:tr>
+        <w:tc>
+          <w:tcPr>
+            <w:tcW w:type="dxa" w:w="2880"/>
+          </w:tcPr>
+          <w:p>
+            <w:r/>
+            <w:r>
+              <w:rPr>
+                <w:rFonts w:ascii="Times New Roman" w:hAnsi="Times New Roman" w:eastAsia="標楷體"/>
+                <w:b w:val="0"/>
+                <w:sz w:val="20"/>
+              </w:rPr>
+              <w:t>moving_y</w:t>
+            </w:r>
+          </w:p>
+        </w:tc>
+        <w:tc>
+          <w:tcPr>
+            <w:tcW w:type="dxa" w:w="2880"/>
+          </w:tcPr>
+          <w:p>
+            <w:r/>
+            <w:r>
+              <w:rPr>
+                <w:rFonts w:ascii="Times New Roman" w:hAnsi="Times New Roman" w:eastAsia="標楷體"/>
+                <w:b w:val="0"/>
+                <w:sz w:val="20"/>
+              </w:rPr>
+              <w:t>+5</w:t>
+            </w:r>
+          </w:p>
+        </w:tc>
+        <w:tc>
+          <w:tcPr>
+            <w:tcW w:type="dxa" w:w="2880"/>
+          </w:tcPr>
+          <w:p>
+            <w:r/>
+            <w:r>
+              <w:rPr>
+                <w:rFonts w:ascii="Times New Roman" w:hAnsi="Times New Roman" w:eastAsia="標楷體"/>
+                <w:b w:val="0"/>
+                <w:sz w:val="20"/>
+              </w:rPr>
+              <w:t>Track lateral velocity $v_y$</w:t>
+            </w:r>
+          </w:p>
+        </w:tc>
+      </w:tr>
+      <w:tr>
+        <w:tc>
+          <w:tcPr>
+            <w:tcW w:type="dxa" w:w="2880"/>
+          </w:tcPr>
+          <w:p>
+            <w:r/>
+            <w:r>
+              <w:rPr>
+                <w:rFonts w:ascii="Times New Roman" w:hAnsi="Times New Roman" w:eastAsia="標楷體"/>
+                <w:b w:val="0"/>
+                <w:sz w:val="20"/>
+              </w:rPr>
+              <w:t>moving_yaw</w:t>
+            </w:r>
+          </w:p>
+        </w:tc>
+        <w:tc>
+          <w:tcPr>
+            <w:tcW w:type="dxa" w:w="2880"/>
+          </w:tcPr>
+          <w:p>
+            <w:r/>
+            <w:r>
+              <w:rPr>
+                <w:rFonts w:ascii="Times New Roman" w:hAnsi="Times New Roman" w:eastAsia="標楷體"/>
+                <w:b w:val="0"/>
+                <w:sz w:val="20"/>
+              </w:rPr>
+              <w:t>+5</w:t>
+            </w:r>
+          </w:p>
+        </w:tc>
+        <w:tc>
+          <w:tcPr>
+            <w:tcW w:type="dxa" w:w="2880"/>
+          </w:tcPr>
+          <w:p>
+            <w:r/>
+            <w:r>
+              <w:rPr>
+                <w:rFonts w:ascii="Times New Roman" w:hAnsi="Times New Roman" w:eastAsia="標楷體"/>
+                <w:b w:val="0"/>
+                <w:sz w:val="20"/>
+              </w:rPr>
+              <w:t>Track yaw rate $\omega_{yaw}$</w:t>
+            </w:r>
+          </w:p>
+        </w:tc>
+      </w:tr>
+      <w:tr>
+        <w:tc>
+          <w:tcPr>
+            <w:tcW w:type="dxa" w:w="2880"/>
+          </w:tcPr>
+          <w:p>
+            <w:r/>
+            <w:r>
+              <w:rPr>
+                <w:rFonts w:ascii="Times New Roman" w:hAnsi="Times New Roman" w:eastAsia="標楷體"/>
+                <w:b w:val="0"/>
+                <w:sz w:val="20"/>
+              </w:rPr>
+              <w:t>soft_dof_pos_limits</w:t>
+            </w:r>
+          </w:p>
+        </w:tc>
+        <w:tc>
+          <w:tcPr>
+            <w:tcW w:type="dxa" w:w="2880"/>
+          </w:tcPr>
+          <w:p>
+            <w:r/>
+            <w:r>
+              <w:rPr>
+                <w:rFonts w:ascii="Times New Roman" w:hAnsi="Times New Roman" w:eastAsia="標楷體"/>
+                <w:b w:val="0"/>
+                <w:sz w:val="20"/>
+              </w:rPr>
+              <w:t>−5</w:t>
+            </w:r>
+          </w:p>
+        </w:tc>
+        <w:tc>
+          <w:tcPr>
+            <w:tcW w:type="dxa" w:w="2880"/>
+          </w:tcPr>
+          <w:p>
+            <w:r/>
+            <w:r>
+              <w:rPr>
+                <w:rFonts w:ascii="Times New Roman" w:hAnsi="Times New Roman" w:eastAsia="標楷體"/>
+                <w:b w:val="0"/>
+                <w:sz w:val="20"/>
+              </w:rPr>
+              <w:t>Avoid sitting near mechanical joint limits</w:t>
+            </w:r>
+          </w:p>
+        </w:tc>
+      </w:tr>
+      <w:tr>
+        <w:tc>
+          <w:tcPr>
+            <w:tcW w:type="dxa" w:w="2880"/>
+          </w:tcPr>
+          <w:p>
+            <w:r/>
+            <w:r>
+              <w:rPr>
+                <w:rFonts w:ascii="Times New Roman" w:hAnsi="Times New Roman" w:eastAsia="標楷體"/>
+                <w:b w:val="0"/>
+                <w:sz w:val="20"/>
+              </w:rPr>
+              <w:t>motor_fatigue</w:t>
+            </w:r>
+          </w:p>
+        </w:tc>
+        <w:tc>
+          <w:tcPr>
+            <w:tcW w:type="dxa" w:w="2880"/>
+          </w:tcPr>
+          <w:p>
+            <w:r/>
+            <w:r>
+              <w:rPr>
+                <w:rFonts w:ascii="Times New Roman" w:hAnsi="Times New Roman" w:eastAsia="標楷體"/>
+                <w:b w:val="0"/>
+                <w:sz w:val="20"/>
+              </w:rPr>
+              <w:t>−0.05</w:t>
+            </w:r>
+          </w:p>
+        </w:tc>
+        <w:tc>
+          <w:tcPr>
+            <w:tcW w:type="dxa" w:w="2880"/>
+          </w:tcPr>
+          <w:p>
+            <w:r/>
+            <w:r>
+              <w:rPr>
+                <w:rFonts w:ascii="Times New Roman" w:hAnsi="Times New Roman" w:eastAsia="標楷體"/>
+                <w:b w:val="0"/>
+                <w:sz w:val="20"/>
+              </w:rPr>
+              <w:t>Small penalty on accumulated fatigue</w:t>
+            </w:r>
+          </w:p>
+        </w:tc>
+      </w:tr>
+      <w:tr>
+        <w:tc>
+          <w:tcPr>
+            <w:tcW w:type="dxa" w:w="2880"/>
+          </w:tcPr>
+          <w:p>
+            <w:r/>
+            <w:r>
+              <w:rPr>
+                <w:rFonts w:ascii="Times New Roman" w:hAnsi="Times New Roman" w:eastAsia="標楷體"/>
+                <w:b w:val="0"/>
+                <w:sz w:val="20"/>
+              </w:rPr>
+              <w:t>dof_acc</w:t>
+            </w:r>
+          </w:p>
+        </w:tc>
+        <w:tc>
+          <w:tcPr>
+            <w:tcW w:type="dxa" w:w="2880"/>
+          </w:tcPr>
+          <w:p>
+            <w:r/>
+            <w:r>
+              <w:rPr>
+                <w:rFonts w:ascii="Times New Roman" w:hAnsi="Times New Roman" w:eastAsia="標楷體"/>
+                <w:b w:val="0"/>
+                <w:sz w:val="20"/>
+              </w:rPr>
+              <w:t>−1×10⁻⁶</w:t>
+            </w:r>
+          </w:p>
+        </w:tc>
+        <w:tc>
+          <w:tcPr>
+            <w:tcW w:type="dxa" w:w="2880"/>
+          </w:tcPr>
+          <w:p>
+            <w:r/>
+            <w:r>
+              <w:rPr>
+                <w:rFonts w:ascii="Times New Roman" w:hAnsi="Times New Roman" w:eastAsia="標楷體"/>
+                <w:b w:val="0"/>
+                <w:sz w:val="20"/>
+              </w:rPr>
+              <w:t>Action smoothness (squared joint acceleration)</w:t>
+            </w:r>
+          </w:p>
+        </w:tc>
+      </w:tr>
+      <w:tr>
+        <w:tc>
+          <w:tcPr>
+            <w:tcW w:type="dxa" w:w="2880"/>
+          </w:tcPr>
+          <w:p>
+            <w:r/>
+            <w:r>
+              <w:rPr>
+                <w:rFonts w:ascii="Times New Roman" w:hAnsi="Times New Roman" w:eastAsia="標楷體"/>
+                <w:b w:val="0"/>
+                <w:sz w:val="20"/>
+              </w:rPr>
+              <w:t>roll</w:t>
+            </w:r>
+          </w:p>
+        </w:tc>
+        <w:tc>
+          <w:tcPr>
+            <w:tcW w:type="dxa" w:w="2880"/>
+          </w:tcPr>
+          <w:p>
+            <w:r/>
+            <w:r>
+              <w:rPr>
+                <w:rFonts w:ascii="Times New Roman" w:hAnsi="Times New Roman" w:eastAsia="標楷體"/>
+                <w:b w:val="0"/>
+                <w:sz w:val="20"/>
+              </w:rPr>
+              <w:t>−5</w:t>
+            </w:r>
+          </w:p>
+        </w:tc>
+        <w:tc>
+          <w:tcPr>
+            <w:tcW w:type="dxa" w:w="2880"/>
+          </w:tcPr>
+          <w:p>
+            <w:r/>
+            <w:r>
+              <w:rPr>
+                <w:rFonts w:ascii="Times New Roman" w:hAnsi="Times New Roman" w:eastAsia="標楷體"/>
+                <w:b w:val="0"/>
+                <w:sz w:val="20"/>
+              </w:rPr>
+              <w:t>Avoid tipping sideways</w:t>
+            </w:r>
+          </w:p>
+        </w:tc>
+      </w:tr>
+      <w:tr>
+        <w:tc>
+          <w:tcPr>
+            <w:tcW w:type="dxa" w:w="2880"/>
+          </w:tcPr>
+          <w:p>
+            <w:r/>
+            <w:r>
+              <w:rPr>
+                <w:rFonts w:ascii="Times New Roman" w:hAnsi="Times New Roman" w:eastAsia="標楷體"/>
+                <w:b w:val="0"/>
+                <w:sz w:val="20"/>
+              </w:rPr>
+              <w:t>lin_vel_z</w:t>
+            </w:r>
+          </w:p>
+        </w:tc>
+        <w:tc>
+          <w:tcPr>
+            <w:tcW w:type="dxa" w:w="2880"/>
+          </w:tcPr>
+          <w:p>
+            <w:r/>
+            <w:r>
+              <w:rPr>
+                <w:rFonts w:ascii="Times New Roman" w:hAnsi="Times New Roman" w:eastAsia="標楷體"/>
+                <w:b w:val="0"/>
+                <w:sz w:val="20"/>
+              </w:rPr>
+              <w:t>−5</w:t>
+            </w:r>
+          </w:p>
+        </w:tc>
+        <w:tc>
+          <w:tcPr>
+            <w:tcW w:type="dxa" w:w="2880"/>
+          </w:tcPr>
+          <w:p>
+            <w:r/>
+            <w:r>
+              <w:rPr>
+                <w:rFonts w:ascii="Times New Roman" w:hAnsi="Times New Roman" w:eastAsia="標楷體"/>
+                <w:b w:val="0"/>
+                <w:sz w:val="20"/>
+              </w:rPr>
+              <w:t>Avoid vertical bouncing</w:t>
+            </w:r>
+          </w:p>
+        </w:tc>
+      </w:tr>
+    </w:tbl>
+    <w:p>
+      <w:r>
+        <w:rPr>
+          <w:rFonts w:ascii="Times New Roman" w:hAnsi="Times New Roman" w:eastAsia="標楷體"/>
+          <w:b w:val="0"/>
+          <w:sz w:val="24"/>
+        </w:rPr>
+        <w:t>This reward design embodies a core trade-off in RL control: the positive terms define "the desired behavior" (walk correctly), while the negative terms constrain "the cost paid" (do not thrash, do not exceed limits). The ablation analysis in later chapters examines precisely how these terms interact with the bio-inspired mechanisms.</w:t>
+      </w:r>
+    </w:p>
+    <w:p>
+      <w:pPr>
+        <w:pStyle w:val="Heading1"/>
+        <w:jc w:val="left"/>
+      </w:pPr>
+      <w:r>
+        <w:rPr>
+          <w:rFonts w:ascii="Times New Roman" w:hAnsi="Times New Roman" w:eastAsia="標楷體"/>
+          <w:b/>
+          <w:sz w:val="32"/>
+        </w:rPr>
+        <w:t>Chapter 3. Core Technology: Torque Control and the Bio-Inspired Locomotion Layer</w:t>
       </w:r>
     </w:p>
     <w:p>
@@ -1006,7 +2388,7 @@
           <w:b/>
           <w:sz w:val="32"/>
         </w:rPr>
-        <w:t>Chapter 3. Practical Implementation I: Reproducing and Analyzing SATA on Isaac Gym</w:t>
+        <w:t>Chapter 4. Practical Implementation I: Reproducing and Analyzing SATA on Isaac Gym</w:t>
       </w:r>
     </w:p>
     <w:p>
@@ -2121,7 +3503,7 @@
           <w:b/>
           <w:sz w:val="32"/>
         </w:rPr>
-        <w:t>Chapter 4. Practical Implementation II: Cross-Engine Migration to Isaac Lab</w:t>
+        <w:t>Chapter 5. Practical Implementation II: Cross-Engine Migration to Isaac Lab</w:t>
       </w:r>
     </w:p>
     <w:p>
@@ -2663,7 +4045,7 @@
           <w:b/>
           <w:sz w:val="32"/>
         </w:rPr>
-        <w:t>Chapter 5. Results and Methodological Rigor</w:t>
+        <w:t>Chapter 6. Results and Methodological Rigor</w:t>
       </w:r>
     </w:p>
     <w:p>
@@ -2839,7 +4221,7 @@
           <w:b/>
           <w:sz w:val="32"/>
         </w:rPr>
-        <w:t>Chapter 6. Conclusion and Reflection</w:t>
+        <w:t>Chapter 7. Conclusion and Reflection</w:t>
       </w:r>
     </w:p>
     <w:p>

</xml_diff>

<commit_message>
Deepen the "why torque control is hard to train" explanation
Beyond citing the paper's "nonlinear / inefficient exploration" wording, add a
mechanistic account in the introduction: position control carries an implicit
stability safety net (the PD restoring force keeps even a random early policy
from diverging), which torque control lacks — random early torque commands
easily produce violent, divergent motion yielding little learning signal; and
the torque→next-state mapping is more indirect/nonlinear (same torque, very
different outcome at different joint velocities/contact states), making the
reward landscape rougher and full of local optima. This motivates SATA's
"shaping" of the action space. Mirrored in both reports.

Co-Authored-By: Claude Opus 4.8 <noreply@anthropic.com>
</commit_message>
<xml_diff>
--- a/docs/report/final_report_english.docx
+++ b/docs/report/final_report_english.docx
@@ -498,7 +498,43 @@
           <w:b w:val="0"/>
           <w:sz w:val="24"/>
         </w:rPr>
-        <w:t xml:space="preserve">Torque control offers the opposite characteristics: by commanding joint torques directly, the robot can "absorb" external forces and recover, much like real muscle. The cost, however, is that it is hard to train. The SATA paper states plainly that the action space of torque control is "highly nonlinear" and that "exploration is inefficient during training," which has made prior torque-based reinforcement learning results fragile and sensitive to hyperparameters. The core claim of SATA is this: rather than brute-forcing the training, one should </w:t>
+        <w:t>Torque control offers the opposite characteristics: by commanding joint torques directly, the robot can "absorb" external forces and recover, much like real muscle. The cost, however, is that it is hard to train. The SATA paper states plainly that the action space of torque control is "highly nonlinear" and that "exploration is inefficient during training," which has made prior torque-based reinforcement learning results fragile and sensitive to hyperparameters.</w:t>
+      </w:r>
+    </w:p>
+    <w:p>
+      <w:r>
+        <w:rPr>
+          <w:rFonts w:ascii="Times New Roman" w:hAnsi="Times New Roman" w:eastAsia="標楷體"/>
+          <w:b w:val="0"/>
+          <w:sz w:val="24"/>
+        </w:rPr>
+        <w:t xml:space="preserve">This difficulty is not a vague claim; it can be understood mechanistically. Position control implicitly carries a </w:t>
+      </w:r>
+      <w:r>
+        <w:rPr>
+          <w:rFonts w:ascii="Times New Roman" w:hAnsi="Times New Roman" w:eastAsia="標楷體"/>
+          <w:b/>
+          <w:sz w:val="24"/>
+        </w:rPr>
+        <w:t>stability safety net</w:t>
+      </w:r>
+      <w:r>
+        <w:rPr>
+          <w:rFonts w:ascii="Times New Roman" w:hAnsi="Times New Roman" w:eastAsia="標楷體"/>
+          <w:b w:val="0"/>
+          <w:sz w:val="24"/>
+        </w:rPr>
+        <w:t>: once the policy outputs a target angle, the PD controller drives the joint toward that angle, and the PD restoring force itself provides basic postural stability, so that even a random early policy does not immediately diverge. Torque control has no such protection -- the policy commands torque directly, and random early exploration easily produces violent, divergent actions (the robot instantly topples or twitches), from which little useful learning signal can accumulate. Moreover, the mapping from "torque" to "the robot's next state" is far more indirect and nonlinear than from "target angle": the same torque has wildly different consequences at different joint velocities and contact states, making the reward landscape rougher and riddled with local optima. This is precisely where SATA intervenes.</w:t>
+      </w:r>
+    </w:p>
+    <w:p>
+      <w:r>
+        <w:rPr>
+          <w:rFonts w:ascii="Times New Roman" w:hAnsi="Times New Roman" w:eastAsia="標楷體"/>
+          <w:b w:val="0"/>
+          <w:sz w:val="24"/>
+        </w:rPr>
+        <w:t xml:space="preserve">The core claim of SATA is this: rather than brute-forcing the training, one should </w:t>
       </w:r>
       <w:r>
         <w:rPr>

</xml_diff>